<commit_message>
Ride reliability: not-on-time percent with color bands, pass-up warning
- Departure line shows the share of past departures more than 1 min early or
  more than 5 min late, colored green (<20%), blue (20-45%) or red (>45%) on the
  rounded value, with a "left early" note when at least 20% left early
- Pass-up line appears only for Medium/High as a warning icon; level stays in
  the accessibility label
- Drop season from the reliability type; history is grouped in two-hour windows
- Docs: progress update in trip-reliability-plan.docx and reliability docs

Co-Authored-By: Claude Opus 5.5 (1M context) <noreply@anthropic.com>
</commit_message>
<xml_diff>
--- a/docs/trip-reliability-plan.docx
+++ b/docs/trip-reliability-plan.docx
@@ -20,7 +20,7 @@
     </w:p>
     <w:p>
       <w:r>
-        <w:t>Updated September 25 2026</w:t>
+        <w:t>Updated September 26 2026</w:t>
       </w:r>
     </w:p>
     <w:p>
@@ -31,6 +31,187 @@
     <w:p>
       <w:r>
         <w:t>Build departure timing first because measured departure outcomes already exist. Develop pass-up estimates in parallel, but publish percentages only where stop matching and service coverage are validated. Keep both measures separate from an overall trip-success probability.</w:t>
+      </w:r>
+    </w:p>
+    <w:p>
+      <w:pPr>
+        <w:pStyle w:val="Heading1"/>
+      </w:pPr>
+      <w:r>
+        <w:t>Progress update, September 26 2026</w:t>
+      </w:r>
+    </w:p>
+    <w:p>
+      <w:r>
+        <w:t xml:space="preserve">This section records what is built and where the plan changed. Sections after it describe the original plan; where they differ, this update is current.</w:t>
+      </w:r>
+    </w:p>
+    <w:p>
+      <w:pPr>
+        <w:pStyle w:val="Heading2"/>
+      </w:pPr>
+      <w:r>
+        <w:t>Grouping and data</w:t>
+      </w:r>
+    </w:p>
+    <w:p>
+      <w:pPr>
+        <w:pStyle w:val="ListBullet"/>
+      </w:pPr>
+      <w:r>
+        <w:t xml:space="preserve">Season removed from the grouping for both departure timing and pass-up risk. Groups are route, boarding stop, direction (normalized destination) and weekday/weekend.</w:t>
+      </w:r>
+    </w:p>
+    <w:p>
+      <w:pPr>
+        <w:pStyle w:val="ListBullet"/>
+      </w:pPr>
+      <w:r>
+        <w:t xml:space="preserve">Time window widened from one hour to fixed two-hour windows starting on even hours (16 covers 16:00–17:59). Grouping id route-stop-destination-daytype-2hour-v1; the backend refuses artifacts built with any other grouping.</w:t>
+      </w:r>
+    </w:p>
+    <w:p>
+      <w:pPr>
+        <w:pStyle w:val="ListBullet"/>
+      </w:pPr>
+      <w:r>
+        <w:t xml:space="preserve">Full rebuild from all post-overhaul departure data: 13 monthly archives (July 2025–July 2026) plus the recent CSV, 46,948,677 retained visits, coverage July 1 2025–September 24 2026, 72 routes, 83,568 departure-timing groups.</w:t>
+      </w:r>
+    </w:p>
+    <w:p>
+      <w:pPr>
+        <w:pStyle w:val="ListBullet"/>
+      </w:pPr>
+      <w:r>
+        <w:t xml:space="preserve">Evidence thresholds unchanged: timing needs 30 visits across 5 dates; pass-up labels keep every sample, zero-report, score, persistence and three-profile agreement gate.</w:t>
+      </w:r>
+    </w:p>
+    <w:p>
+      <w:pPr>
+        <w:pStyle w:val="Heading2"/>
+      </w:pPr>
+      <w:r>
+        <w:t>Pass-up labels</w:t>
+      </w:r>
+    </w:p>
+    <w:p>
+      <w:pPr>
+        <w:pStyle w:val="ListBullet"/>
+      </w:pPr>
+      <w:r>
+        <w:t xml:space="preserve">Policy reported-pattern-v2 (approved by Linpu): a report that cannot be matched to one stop and visit is left out of the counts and no longer turns nearby groups Unknown. The backend accepts only v2 risk artifacts.</w:t>
+      </w:r>
+    </w:p>
+    <w:p>
+      <w:pPr>
+        <w:pStyle w:val="ListBullet"/>
+      </w:pPr>
+      <w:r>
+        <w:t xml:space="preserve">Current counts: 70,544 Low, 28 Medium, 0 High, 23,035 Unknown (22,983 insufficient history or persistence, 52 matching-sensitive). Under v1 with the same grouping there were no Medium labels.</w:t>
+      </w:r>
+    </w:p>
+    <w:p>
+      <w:pPr>
+        <w:pStyle w:val="Heading2"/>
+      </w:pPr>
+      <w:r>
+        <w:t>What the app shows</w:t>
+      </w:r>
+    </w:p>
+    <w:p>
+      <w:pPr>
+        <w:pStyle w:val="ListBullet"/>
+      </w:pPr>
+      <w:r>
+        <w:t xml:space="preserve">Departure: percentage of past departures not on time, meaning more than 1 minute early or more than 5 minutes late, for example “Departure: 46% not on time (&gt;1 min early / &gt;5 min late) · 38% left early”. 5 minutes was kept over 3 minutes: a typical group is 26% not on time at 5 minutes and 38% at 3 minutes.</w:t>
+      </w:r>
+    </w:p>
+    <w:p>
+      <w:pPr>
+        <w:pStyle w:val="ListBullet"/>
+      </w:pPr>
+      <w:r>
+        <w:t xml:space="preserve">The percentage is colored: green below 20%, blue 20–45%, red above 45%, applied to the rounded value shown. The “left early” note appears when at least 20% of departures left more than 1 minute early.</w:t>
+      </w:r>
+    </w:p>
+    <w:p>
+      <w:pPr>
+        <w:pStyle w:val="ListBullet"/>
+      </w:pPr>
+      <w:r>
+        <w:t xml:space="preserve">Pass-up: shown only for Medium or High, as “Historical pass-up risk: ⚠️”, with the level in the accessibility label. Low and Unknown show no pass-up line.</w:t>
+      </w:r>
+    </w:p>
+    <w:p>
+      <w:pPr>
+        <w:pStyle w:val="ListBullet"/>
+      </w:pPr>
+      <w:r>
+        <w:t xml:space="preserve">Trip history keeps one entry per trip (same origin and destination within about 10 m; reversed trips are separate). Re-planning moves the trip to the top; the list holds the last 10 different trips.</w:t>
+      </w:r>
+    </w:p>
+    <w:p>
+      <w:pPr>
+        <w:pStyle w:val="Heading2"/>
+      </w:pPr>
+      <w:r>
+        <w:t>Test trip: 77 Westbrook St to 70 Thatcher Dr, Saturday September 26 2026, 16:40</w:t>
+      </w:r>
+    </w:p>
+    <w:p>
+      <w:pPr>
+        <w:pStyle w:val="ListBullet"/>
+      </w:pPr>
+      <w:r>
+        <w:t xml:space="preserve">Before this work: departure timing on 4 of 9 rides (BLUE Unavailable on all 5 plans) and pass-up labels on 0 of 9 (all Unknown).</w:t>
+      </w:r>
+    </w:p>
+    <w:p>
+      <w:pPr>
+        <w:pStyle w:val="ListBullet"/>
+      </w:pPr>
+      <w:r>
+        <w:t xml:space="preserve">Now: timing on 9 of 9 rides and pass-up labels on 9 of 9 (all Low, so no warning). BLUE 16:47/17:07 37% not on time (blue); F8 17:11 18% (green); F8 17:09 46% (red, 38% left early); F9 17:22 31% (blue); F9 17:33 50% (red, 40% left early).</w:t>
+      </w:r>
+    </w:p>
+    <w:p>
+      <w:pPr>
+        <w:pStyle w:val="Heading2"/>
+      </w:pPr>
+      <w:r>
+        <w:t>Open items</w:t>
+      </w:r>
+    </w:p>
+    <w:p>
+      <w:pPr>
+        <w:pStyle w:val="ListBullet"/>
+      </w:pPr>
+      <w:r>
+        <w:t xml:space="preserve">Run supabase/migrations/202609260001_dedupe_trip_history.sql once in the Supabase SQL Editor. Until then the app hides duplicate history entries but the database still stores them.</w:t>
+      </w:r>
+    </w:p>
+    <w:p>
+      <w:pPr>
+        <w:pStyle w:val="ListBullet"/>
+      </w:pPr>
+      <w:r>
+        <w:t xml:space="preserve">Not deployed: the backend with the new data files and the app changes are local only. Restart the backend and Expo to test; deploy when ready.</w:t>
+      </w:r>
+    </w:p>
+    <w:p>
+      <w:pPr>
+        <w:pStyle w:val="ListBullet"/>
+      </w:pPr>
+      <w:r>
+        <w:t xml:space="preserve">Thresholds remain provisional engineering choices: pass-up score boundaries, the 30-visit/5-date timing minimum, the 5-minute late cutoff and the color bands. No calibrated probability is claimed.</w:t>
+      </w:r>
+    </w:p>
+    <w:p>
+      <w:pPr>
+        <w:pStyle w:val="ListBullet"/>
+      </w:pPr>
+      <w:r>
+        <w:t xml:space="preserve">Refresh the data within 30 days of September 24 2026 (the backend freshness limit) and keep the 2026 holiday calendar current.</w:t>
       </w:r>
     </w:p>
     <w:p>

</xml_diff>